<commit_message>
Faza 2 - nova verzija sajta
</commit_message>
<xml_diff>
--- a/master prompt.docx
+++ b/master prompt.docx
@@ -68,6 +68,142 @@
         </w:rPr>
         <w:t>Admin je isti mejl Aleksej21*</w:t>
       </w:r>
+    </w:p>
+    <w:p>
+      <w:pPr>
+        <w:pStyle w:val="HTMLPreformatted"/>
+        <w:rPr>
+          <w:rStyle w:val="HTMLCode"/>
+          <w:rFonts w:ascii="Times New Roman" w:hAnsi="Times New Roman" w:cs="Times New Roman"/>
+          <w:sz w:val="24"/>
+          <w:szCs w:val="24"/>
+        </w:rPr>
+      </w:pPr>
+    </w:p>
+    <w:p>
+      <w:pPr>
+        <w:pStyle w:val="HTMLPreformatted"/>
+        <w:rPr>
+          <w:rStyle w:val="HTMLCode"/>
+          <w:rFonts w:ascii="Times New Roman" w:hAnsi="Times New Roman" w:cs="Times New Roman"/>
+          <w:sz w:val="24"/>
+          <w:szCs w:val="24"/>
+        </w:rPr>
+      </w:pPr>
+      <w:r>
+        <w:rPr>
+          <w:rStyle w:val="HTMLCode"/>
+          <w:rFonts w:ascii="Times New Roman" w:hAnsi="Times New Roman" w:cs="Times New Roman"/>
+          <w:sz w:val="24"/>
+          <w:szCs w:val="24"/>
+        </w:rPr>
+        <w:t>Ninkovic91Aleksej21*</w:t>
+      </w:r>
+      <w:r>
+        <w:rPr>
+          <w:rStyle w:val="HTMLCode"/>
+          <w:rFonts w:ascii="Times New Roman" w:hAnsi="Times New Roman" w:cs="Times New Roman"/>
+          <w:sz w:val="24"/>
+          <w:szCs w:val="24"/>
+        </w:rPr>
+        <w:t xml:space="preserve"> od </w:t>
+      </w:r>
+      <w:r>
+        <w:rPr>
+          <w:rStyle w:val="HTMLCode"/>
+          <w:rFonts w:ascii="Times New Roman" w:hAnsi="Times New Roman" w:cs="Times New Roman"/>
+          <w:sz w:val="24"/>
+          <w:szCs w:val="24"/>
+        </w:rPr>
+        <w:t>WEBHOOK_SECRET</w:t>
+      </w:r>
+    </w:p>
+    <w:p>
+      <w:pPr>
+        <w:pStyle w:val="HTMLPreformatted"/>
+        <w:rPr>
+          <w:rStyle w:val="HTMLCode"/>
+          <w:rFonts w:ascii="Times New Roman" w:hAnsi="Times New Roman" w:cs="Times New Roman"/>
+          <w:sz w:val="24"/>
+          <w:szCs w:val="24"/>
+        </w:rPr>
+      </w:pPr>
+      <w:r>
+        <w:rPr>
+          <w:rStyle w:val="HTMLCode"/>
+          <w:rFonts w:ascii="Times New Roman" w:hAnsi="Times New Roman" w:cs="Times New Roman"/>
+          <w:sz w:val="24"/>
+          <w:szCs w:val="24"/>
+        </w:rPr>
+        <w:t>RESEND_API_KEY</w:t>
+      </w:r>
+      <w:r>
+        <w:rPr>
+          <w:rStyle w:val="HTMLCode"/>
+          <w:rFonts w:ascii="Times New Roman" w:hAnsi="Times New Roman" w:cs="Times New Roman"/>
+          <w:sz w:val="24"/>
+          <w:szCs w:val="24"/>
+        </w:rPr>
+        <w:t xml:space="preserve"> je  </w:t>
+      </w:r>
+      <w:r>
+        <w:rPr>
+          <w:rStyle w:val="HTMLCode"/>
+          <w:rFonts w:ascii="Times New Roman" w:hAnsi="Times New Roman" w:cs="Times New Roman"/>
+          <w:sz w:val="24"/>
+          <w:szCs w:val="24"/>
+        </w:rPr>
+        <w:t>re_ead3DFbh_LS4f2k7X5j8LAr7hZ23VGBaN</w:t>
+      </w:r>
+    </w:p>
+    <w:p>
+      <w:pPr>
+        <w:pStyle w:val="HTMLPreformatted"/>
+        <w:rPr>
+          <w:rStyle w:val="HTMLCode"/>
+          <w:rFonts w:ascii="Times New Roman" w:hAnsi="Times New Roman" w:cs="Times New Roman"/>
+          <w:sz w:val="24"/>
+          <w:szCs w:val="24"/>
+        </w:rPr>
+      </w:pPr>
+    </w:p>
+    <w:p>
+      <w:pPr>
+        <w:pStyle w:val="HTMLPreformatted"/>
+        <w:rPr>
+          <w:rStyle w:val="HTMLCode"/>
+          <w:rFonts w:ascii="Times New Roman" w:hAnsi="Times New Roman" w:cs="Times New Roman"/>
+          <w:sz w:val="24"/>
+          <w:szCs w:val="24"/>
+        </w:rPr>
+      </w:pPr>
+      <w:r>
+        <w:rPr>
+          <w:rStyle w:val="HTMLCode"/>
+          <w:rFonts w:ascii="Times New Roman" w:hAnsi="Times New Roman" w:cs="Times New Roman"/>
+          <w:sz w:val="24"/>
+          <w:szCs w:val="24"/>
+        </w:rPr>
+        <w:t xml:space="preserve"> KOMPLET SPEC + PLAN</w:t>
+      </w:r>
+      <w:r>
+        <w:rPr>
+          <w:rStyle w:val="HTMLCode"/>
+          <w:rFonts w:ascii="Times New Roman" w:hAnsi="Times New Roman" w:cs="Times New Roman"/>
+          <w:sz w:val="24"/>
+          <w:szCs w:val="24"/>
+        </w:rPr>
+        <w:t xml:space="preserve"> </w:t>
+      </w:r>
+      <w:r>
+        <w:rPr>
+          <w:rStyle w:val="HTMLCode"/>
+          <w:rFonts w:ascii="Times New Roman" w:hAnsi="Times New Roman" w:cs="Times New Roman"/>
+          <w:sz w:val="24"/>
+          <w:szCs w:val="24"/>
+        </w:rPr>
+        <w:t xml:space="preserve"> I promeni unotify email sada je evovlade91 kada registrujes domen u edge secret</w:t>
+      </w:r>
       <w:bookmarkStart w:id="0" w:name="_GoBack"/>
       <w:bookmarkEnd w:id="0"/>
     </w:p>
@@ -99,37 +235,6 @@
           <w:sz w:val="24"/>
           <w:szCs w:val="24"/>
         </w:rPr>
-        <w:t xml:space="preserve"> KOMPLET SPEC + PLAN</w:t>
-      </w:r>
-    </w:p>
-    <w:p>
-      <w:pPr>
-        <w:pStyle w:val="HTMLPreformatted"/>
-        <w:rPr>
-          <w:rStyle w:val="HTMLCode"/>
-          <w:rFonts w:ascii="Times New Roman" w:hAnsi="Times New Roman" w:cs="Times New Roman"/>
-          <w:sz w:val="24"/>
-          <w:szCs w:val="24"/>
-        </w:rPr>
-      </w:pPr>
-    </w:p>
-    <w:p>
-      <w:pPr>
-        <w:pStyle w:val="HTMLPreformatted"/>
-        <w:rPr>
-          <w:rStyle w:val="HTMLCode"/>
-          <w:rFonts w:ascii="Times New Roman" w:hAnsi="Times New Roman" w:cs="Times New Roman"/>
-          <w:sz w:val="24"/>
-          <w:szCs w:val="24"/>
-        </w:rPr>
-      </w:pPr>
-      <w:r>
-        <w:rPr>
-          <w:rStyle w:val="HTMLCode"/>
-          <w:rFonts w:ascii="Times New Roman" w:hAnsi="Times New Roman" w:cs="Times New Roman"/>
-          <w:sz w:val="24"/>
-          <w:szCs w:val="24"/>
-        </w:rPr>
         <w:t>Kontekst:</w:t>
       </w:r>
     </w:p>
@@ -593,904 +698,6 @@
           <w:szCs w:val="24"/>
         </w:rPr>
         <w:t>- subpages: pravila/, restavracije/, soca-live/, izgubljeno-nadjeno/, rezervisi-ponovo/, virtuelna-tura/</w:t>
-      </w:r>
-    </w:p>
-    <w:p>
-      <w:pPr>
-        <w:pStyle w:val="HTMLPreformatted"/>
-        <w:rPr>
-          <w:rStyle w:val="HTMLCode"/>
-          <w:rFonts w:ascii="Times New Roman" w:hAnsi="Times New Roman" w:cs="Times New Roman"/>
-          <w:sz w:val="24"/>
-          <w:szCs w:val="24"/>
-        </w:rPr>
-      </w:pPr>
-    </w:p>
-    <w:p>
-      <w:pPr>
-        <w:pStyle w:val="HTMLPreformatted"/>
-        <w:rPr>
-          <w:rStyle w:val="HTMLCode"/>
-          <w:rFonts w:ascii="Times New Roman" w:hAnsi="Times New Roman" w:cs="Times New Roman"/>
-          <w:sz w:val="24"/>
-          <w:szCs w:val="24"/>
-        </w:rPr>
-      </w:pPr>
-      <w:r>
-        <w:rPr>
-          <w:rStyle w:val="HTMLCode"/>
-          <w:rFonts w:ascii="Times New Roman" w:hAnsi="Times New Roman" w:cs="Times New Roman"/>
-          <w:sz w:val="24"/>
-          <w:szCs w:val="24"/>
-        </w:rPr>
-        <w:t>========================</w:t>
-      </w:r>
-    </w:p>
-    <w:p>
-      <w:pPr>
-        <w:pStyle w:val="HTMLPreformatted"/>
-        <w:rPr>
-          <w:rStyle w:val="HTMLCode"/>
-          <w:rFonts w:ascii="Times New Roman" w:hAnsi="Times New Roman" w:cs="Times New Roman"/>
-          <w:sz w:val="24"/>
-          <w:szCs w:val="24"/>
-        </w:rPr>
-      </w:pPr>
-      <w:r>
-        <w:rPr>
-          <w:rStyle w:val="HTMLCode"/>
-          <w:rFonts w:ascii="Times New Roman" w:hAnsi="Times New Roman" w:cs="Times New Roman"/>
-          <w:sz w:val="24"/>
-          <w:szCs w:val="24"/>
-        </w:rPr>
-        <w:t>B) CILJ (SaaS)</w:t>
-      </w:r>
-    </w:p>
-    <w:p>
-      <w:pPr>
-        <w:pStyle w:val="HTMLPreformatted"/>
-        <w:rPr>
-          <w:rStyle w:val="HTMLCode"/>
-          <w:rFonts w:ascii="Times New Roman" w:hAnsi="Times New Roman" w:cs="Times New Roman"/>
-          <w:sz w:val="24"/>
-          <w:szCs w:val="24"/>
-        </w:rPr>
-      </w:pPr>
-      <w:r>
-        <w:rPr>
-          <w:rStyle w:val="HTMLCode"/>
-          <w:rFonts w:ascii="Times New Roman" w:hAnsi="Times New Roman" w:cs="Times New Roman"/>
-          <w:sz w:val="24"/>
-          <w:szCs w:val="24"/>
-        </w:rPr>
-        <w:t>1) Multi-tenant: jedan kod, više apartmana (tenants). Svaki tenant može imati override sadržaja.</w:t>
-      </w:r>
-    </w:p>
-    <w:p>
-      <w:pPr>
-        <w:pStyle w:val="HTMLPreformatted"/>
-        <w:rPr>
-          <w:rStyle w:val="HTMLCode"/>
-          <w:rFonts w:ascii="Times New Roman" w:hAnsi="Times New Roman" w:cs="Times New Roman"/>
-          <w:sz w:val="24"/>
-          <w:szCs w:val="24"/>
-        </w:rPr>
-      </w:pPr>
-      <w:r>
-        <w:rPr>
-          <w:rStyle w:val="HTMLCode"/>
-          <w:rFonts w:ascii="Times New Roman" w:hAnsi="Times New Roman" w:cs="Times New Roman"/>
-          <w:sz w:val="24"/>
-          <w:szCs w:val="24"/>
-        </w:rPr>
-        <w:t>2) Dve uloge:</w:t>
-      </w:r>
-    </w:p>
-    <w:p>
-      <w:pPr>
-        <w:pStyle w:val="HTMLPreformatted"/>
-        <w:rPr>
-          <w:rStyle w:val="HTMLCode"/>
-          <w:rFonts w:ascii="Times New Roman" w:hAnsi="Times New Roman" w:cs="Times New Roman"/>
-          <w:sz w:val="24"/>
-          <w:szCs w:val="24"/>
-        </w:rPr>
-      </w:pPr>
-      <w:r>
-        <w:rPr>
-          <w:rStyle w:val="HTMLCode"/>
-          <w:rFonts w:ascii="Times New Roman" w:hAnsi="Times New Roman" w:cs="Times New Roman"/>
-          <w:sz w:val="24"/>
-          <w:szCs w:val="24"/>
-        </w:rPr>
-        <w:lastRenderedPageBreak/>
-        <w:t xml:space="preserve">   - MASTER: sve (global content, layout, parking public, translations, permissions, tenants/users)</w:t>
-      </w:r>
-    </w:p>
-    <w:p>
-      <w:pPr>
-        <w:pStyle w:val="HTMLPreformatted"/>
-        <w:rPr>
-          <w:rStyle w:val="HTMLCode"/>
-          <w:rFonts w:ascii="Times New Roman" w:hAnsi="Times New Roman" w:cs="Times New Roman"/>
-          <w:sz w:val="24"/>
-          <w:szCs w:val="24"/>
-        </w:rPr>
-      </w:pPr>
-      <w:r>
-        <w:rPr>
-          <w:rStyle w:val="HTMLCode"/>
-          <w:rFonts w:ascii="Times New Roman" w:hAnsi="Times New Roman" w:cs="Times New Roman"/>
-          <w:sz w:val="24"/>
-          <w:szCs w:val="24"/>
-        </w:rPr>
-        <w:t xml:space="preserve">   - OWNER: samo svoj tenant, i samo ono što mu MASTER dozvoli</w:t>
-      </w:r>
-    </w:p>
-    <w:p>
-      <w:pPr>
-        <w:pStyle w:val="HTMLPreformatted"/>
-        <w:rPr>
-          <w:rStyle w:val="HTMLCode"/>
-          <w:rFonts w:ascii="Times New Roman" w:hAnsi="Times New Roman" w:cs="Times New Roman"/>
-          <w:sz w:val="24"/>
-          <w:szCs w:val="24"/>
-        </w:rPr>
-      </w:pPr>
-      <w:r>
-        <w:rPr>
-          <w:rStyle w:val="HTMLCode"/>
-          <w:rFonts w:ascii="Times New Roman" w:hAnsi="Times New Roman" w:cs="Times New Roman"/>
-          <w:sz w:val="24"/>
-          <w:szCs w:val="24"/>
-        </w:rPr>
-        <w:t>3) Sve dinamično:</w:t>
-      </w:r>
-    </w:p>
-    <w:p>
-      <w:pPr>
-        <w:pStyle w:val="HTMLPreformatted"/>
-        <w:rPr>
-          <w:rStyle w:val="HTMLCode"/>
-          <w:rFonts w:ascii="Times New Roman" w:hAnsi="Times New Roman" w:cs="Times New Roman"/>
-          <w:sz w:val="24"/>
-          <w:szCs w:val="24"/>
-        </w:rPr>
-      </w:pPr>
-      <w:r>
-        <w:rPr>
-          <w:rStyle w:val="HTMLCode"/>
-          <w:rFonts w:ascii="Times New Roman" w:hAnsi="Times New Roman" w:cs="Times New Roman"/>
-          <w:sz w:val="24"/>
-          <w:szCs w:val="24"/>
-        </w:rPr>
-        <w:t xml:space="preserve">   - svaka kartica/sekcija mora podržati add/edit/hide/reorder stavki bez deploy-a</w:t>
-      </w:r>
-    </w:p>
-    <w:p>
-      <w:pPr>
-        <w:pStyle w:val="HTMLPreformatted"/>
-        <w:rPr>
-          <w:rStyle w:val="HTMLCode"/>
-          <w:rFonts w:ascii="Times New Roman" w:hAnsi="Times New Roman" w:cs="Times New Roman"/>
-          <w:sz w:val="24"/>
-          <w:szCs w:val="24"/>
-        </w:rPr>
-      </w:pPr>
-      <w:r>
-        <w:rPr>
-          <w:rStyle w:val="HTMLCode"/>
-          <w:rFonts w:ascii="Times New Roman" w:hAnsi="Times New Roman" w:cs="Times New Roman"/>
-          <w:sz w:val="24"/>
-          <w:szCs w:val="24"/>
-        </w:rPr>
-        <w:t xml:space="preserve">   - vidljivost sekcija i redosled kartica admin-kontrolisani</w:t>
-      </w:r>
-    </w:p>
-    <w:p>
-      <w:pPr>
-        <w:pStyle w:val="HTMLPreformatted"/>
-        <w:rPr>
-          <w:rStyle w:val="HTMLCode"/>
-          <w:rFonts w:ascii="Times New Roman" w:hAnsi="Times New Roman" w:cs="Times New Roman"/>
-          <w:sz w:val="24"/>
-          <w:szCs w:val="24"/>
-        </w:rPr>
-      </w:pPr>
-      <w:r>
-        <w:rPr>
-          <w:rStyle w:val="HTMLCode"/>
-          <w:rFonts w:ascii="Times New Roman" w:hAnsi="Times New Roman" w:cs="Times New Roman"/>
-          <w:sz w:val="24"/>
-          <w:szCs w:val="24"/>
-        </w:rPr>
-        <w:t>4) Parking:</w:t>
-      </w:r>
-    </w:p>
-    <w:p>
-      <w:pPr>
-        <w:pStyle w:val="HTMLPreformatted"/>
-        <w:rPr>
-          <w:rStyle w:val="HTMLCode"/>
-          <w:rFonts w:ascii="Times New Roman" w:hAnsi="Times New Roman" w:cs="Times New Roman"/>
-          <w:sz w:val="24"/>
-          <w:szCs w:val="24"/>
-        </w:rPr>
-      </w:pPr>
-      <w:r>
-        <w:rPr>
-          <w:rStyle w:val="HTMLCode"/>
-          <w:rFonts w:ascii="Times New Roman" w:hAnsi="Times New Roman" w:cs="Times New Roman"/>
-          <w:sz w:val="24"/>
-          <w:szCs w:val="24"/>
-        </w:rPr>
-        <w:t xml:space="preserve">   - PUBLIC parking (global, master editable) + filter po town (kao sada)</w:t>
-      </w:r>
-    </w:p>
-    <w:p>
-      <w:pPr>
-        <w:pStyle w:val="HTMLPreformatted"/>
-        <w:rPr>
-          <w:rStyle w:val="HTMLCode"/>
-          <w:rFonts w:ascii="Times New Roman" w:hAnsi="Times New Roman" w:cs="Times New Roman"/>
-          <w:sz w:val="24"/>
-          <w:szCs w:val="24"/>
-        </w:rPr>
-      </w:pPr>
-      <w:r>
-        <w:rPr>
-          <w:rStyle w:val="HTMLCode"/>
-          <w:rFonts w:ascii="Times New Roman" w:hAnsi="Times New Roman" w:cs="Times New Roman"/>
-          <w:sz w:val="24"/>
-          <w:szCs w:val="24"/>
-        </w:rPr>
-        <w:t xml:space="preserve">   - PRIVATE parking (tenant scoped, owner editable)</w:t>
-      </w:r>
-    </w:p>
-    <w:p>
-      <w:pPr>
-        <w:pStyle w:val="HTMLPreformatted"/>
-        <w:rPr>
-          <w:rStyle w:val="HTMLCode"/>
-          <w:rFonts w:ascii="Times New Roman" w:hAnsi="Times New Roman" w:cs="Times New Roman"/>
-          <w:sz w:val="24"/>
-          <w:szCs w:val="24"/>
-        </w:rPr>
-      </w:pPr>
-      <w:r>
-        <w:rPr>
-          <w:rStyle w:val="HTMLCode"/>
-          <w:rFonts w:ascii="Times New Roman" w:hAnsi="Times New Roman" w:cs="Times New Roman"/>
-          <w:sz w:val="24"/>
-          <w:szCs w:val="24"/>
-        </w:rPr>
-        <w:t xml:space="preserve">   - zadržati assets/data/parking folder kao fallback/seed dok DB ne bude uveden</w:t>
-      </w:r>
-    </w:p>
-    <w:p>
-      <w:pPr>
-        <w:pStyle w:val="HTMLPreformatted"/>
-        <w:rPr>
-          <w:rStyle w:val="HTMLCode"/>
-          <w:rFonts w:ascii="Times New Roman" w:hAnsi="Times New Roman" w:cs="Times New Roman"/>
-          <w:sz w:val="24"/>
-          <w:szCs w:val="24"/>
-        </w:rPr>
-      </w:pPr>
-    </w:p>
-    <w:p>
-      <w:pPr>
-        <w:pStyle w:val="HTMLPreformatted"/>
-        <w:rPr>
-          <w:rStyle w:val="HTMLCode"/>
-          <w:rFonts w:ascii="Times New Roman" w:hAnsi="Times New Roman" w:cs="Times New Roman"/>
-          <w:sz w:val="24"/>
-          <w:szCs w:val="24"/>
-        </w:rPr>
-      </w:pPr>
-      <w:r>
-        <w:rPr>
-          <w:rStyle w:val="HTMLCode"/>
-          <w:rFonts w:ascii="Times New Roman" w:hAnsi="Times New Roman" w:cs="Times New Roman"/>
-          <w:sz w:val="24"/>
-          <w:szCs w:val="24"/>
-        </w:rPr>
-        <w:t>========================</w:t>
-      </w:r>
-    </w:p>
-    <w:p>
-      <w:pPr>
-        <w:pStyle w:val="HTMLPreformatted"/>
-        <w:rPr>
-          <w:rStyle w:val="HTMLCode"/>
-          <w:rFonts w:ascii="Times New Roman" w:hAnsi="Times New Roman" w:cs="Times New Roman"/>
-          <w:sz w:val="24"/>
-          <w:szCs w:val="24"/>
-        </w:rPr>
-      </w:pPr>
-      <w:r>
-        <w:rPr>
-          <w:rStyle w:val="HTMLCode"/>
-          <w:rFonts w:ascii="Times New Roman" w:hAnsi="Times New Roman" w:cs="Times New Roman"/>
-          <w:sz w:val="24"/>
-          <w:szCs w:val="24"/>
-        </w:rPr>
-        <w:t>C) PERMISIJЕ (DEFAULT)</w:t>
-      </w:r>
-    </w:p>
-    <w:p>
-      <w:pPr>
-        <w:pStyle w:val="HTMLPreformatted"/>
-        <w:rPr>
-          <w:rStyle w:val="HTMLCode"/>
-          <w:rFonts w:ascii="Times New Roman" w:hAnsi="Times New Roman" w:cs="Times New Roman"/>
-          <w:sz w:val="24"/>
-          <w:szCs w:val="24"/>
-        </w:rPr>
-      </w:pPr>
-      <w:r>
-        <w:rPr>
-          <w:rStyle w:val="HTMLCode"/>
-          <w:rFonts w:ascii="Times New Roman" w:hAnsi="Times New Roman" w:cs="Times New Roman"/>
-          <w:sz w:val="24"/>
-          <w:szCs w:val="24"/>
-        </w:rPr>
-        <w:t>MASTER:</w:t>
-      </w:r>
-    </w:p>
-    <w:p>
-      <w:pPr>
-        <w:pStyle w:val="HTMLPreformatted"/>
-        <w:rPr>
-          <w:rStyle w:val="HTMLCode"/>
-          <w:rFonts w:ascii="Times New Roman" w:hAnsi="Times New Roman" w:cs="Times New Roman"/>
-          <w:sz w:val="24"/>
-          <w:szCs w:val="24"/>
-        </w:rPr>
-      </w:pPr>
-      <w:r>
-        <w:rPr>
-          <w:rStyle w:val="HTMLCode"/>
-          <w:rFonts w:ascii="Times New Roman" w:hAnsi="Times New Roman" w:cs="Times New Roman"/>
-          <w:sz w:val="24"/>
-          <w:szCs w:val="24"/>
-        </w:rPr>
-        <w:t>- edit sve</w:t>
-      </w:r>
-    </w:p>
-    <w:p>
-      <w:pPr>
-        <w:pStyle w:val="HTMLPreformatted"/>
-        <w:rPr>
-          <w:rStyle w:val="HTMLCode"/>
-          <w:rFonts w:ascii="Times New Roman" w:hAnsi="Times New Roman" w:cs="Times New Roman"/>
-          <w:sz w:val="24"/>
-          <w:szCs w:val="24"/>
-        </w:rPr>
-      </w:pPr>
-      <w:r>
-        <w:rPr>
-          <w:rStyle w:val="HTMLCode"/>
-          <w:rFonts w:ascii="Times New Roman" w:hAnsi="Times New Roman" w:cs="Times New Roman"/>
-          <w:sz w:val="24"/>
-          <w:szCs w:val="24"/>
-        </w:rPr>
-        <w:t>OWNER default može edit:</w:t>
-      </w:r>
-    </w:p>
-    <w:p>
-      <w:pPr>
-        <w:pStyle w:val="HTMLPreformatted"/>
-        <w:rPr>
-          <w:rStyle w:val="HTMLCode"/>
-          <w:rFonts w:ascii="Times New Roman" w:hAnsi="Times New Roman" w:cs="Times New Roman"/>
-          <w:sz w:val="24"/>
-          <w:szCs w:val="24"/>
-        </w:rPr>
-      </w:pPr>
-      <w:r>
-        <w:rPr>
-          <w:rStyle w:val="HTMLCode"/>
-          <w:rFonts w:ascii="Times New Roman" w:hAnsi="Times New Roman" w:cs="Times New Roman"/>
-          <w:sz w:val="24"/>
-          <w:szCs w:val="24"/>
-        </w:rPr>
-        <w:t>- apartment_name</w:t>
-      </w:r>
-    </w:p>
-    <w:p>
-      <w:pPr>
-        <w:pStyle w:val="HTMLPreformatted"/>
-        <w:rPr>
-          <w:rStyle w:val="HTMLCode"/>
-          <w:rFonts w:ascii="Times New Roman" w:hAnsi="Times New Roman" w:cs="Times New Roman"/>
-          <w:sz w:val="24"/>
-          <w:szCs w:val="24"/>
-        </w:rPr>
-      </w:pPr>
-      <w:r>
-        <w:rPr>
-          <w:rStyle w:val="HTMLCode"/>
-          <w:rFonts w:ascii="Times New Roman" w:hAnsi="Times New Roman" w:cs="Times New Roman"/>
-          <w:sz w:val="24"/>
-          <w:szCs w:val="24"/>
-        </w:rPr>
-        <w:t>- owner_phone (i opcionalno whatsapp ako postoji)</w:t>
-      </w:r>
-    </w:p>
-    <w:p>
-      <w:pPr>
-        <w:pStyle w:val="HTMLPreformatted"/>
-        <w:rPr>
-          <w:rStyle w:val="HTMLCode"/>
-          <w:rFonts w:ascii="Times New Roman" w:hAnsi="Times New Roman" w:cs="Times New Roman"/>
-          <w:sz w:val="24"/>
-          <w:szCs w:val="24"/>
-        </w:rPr>
-      </w:pPr>
-      <w:r>
-        <w:rPr>
-          <w:rStyle w:val="HTMLCode"/>
-          <w:rFonts w:ascii="Times New Roman" w:hAnsi="Times New Roman" w:cs="Times New Roman"/>
-          <w:sz w:val="24"/>
-          <w:szCs w:val="24"/>
-        </w:rPr>
-        <w:t>- apartment_navigation_link (npr. directions/maps link do apartmana ili link do pravila)</w:t>
-      </w:r>
-    </w:p>
-    <w:p>
-      <w:pPr>
-        <w:pStyle w:val="HTMLPreformatted"/>
-        <w:rPr>
-          <w:rStyle w:val="HTMLCode"/>
-          <w:rFonts w:ascii="Times New Roman" w:hAnsi="Times New Roman" w:cs="Times New Roman"/>
-          <w:sz w:val="24"/>
-          <w:szCs w:val="24"/>
-        </w:rPr>
-      </w:pPr>
-      <w:r>
-        <w:rPr>
-          <w:rStyle w:val="HTMLCode"/>
-          <w:rFonts w:ascii="Times New Roman" w:hAnsi="Times New Roman" w:cs="Times New Roman"/>
-          <w:sz w:val="24"/>
-          <w:szCs w:val="24"/>
-        </w:rPr>
-        <w:t>- private_house_rules (tenant-specific)</w:t>
-      </w:r>
-    </w:p>
-    <w:p>
-      <w:pPr>
-        <w:pStyle w:val="HTMLPreformatted"/>
-        <w:rPr>
-          <w:rStyle w:val="HTMLCode"/>
-          <w:rFonts w:ascii="Times New Roman" w:hAnsi="Times New Roman" w:cs="Times New Roman"/>
-          <w:sz w:val="24"/>
-          <w:szCs w:val="24"/>
-        </w:rPr>
-      </w:pPr>
-      <w:r>
-        <w:rPr>
-          <w:rStyle w:val="HTMLCode"/>
-          <w:rFonts w:ascii="Times New Roman" w:hAnsi="Times New Roman" w:cs="Times New Roman"/>
-          <w:sz w:val="24"/>
-          <w:szCs w:val="24"/>
-        </w:rPr>
-        <w:t>- private_parking (tenant-specific)</w:t>
-      </w:r>
-    </w:p>
-    <w:p>
-      <w:pPr>
-        <w:pStyle w:val="HTMLPreformatted"/>
-        <w:rPr>
-          <w:rStyle w:val="HTMLCode"/>
-          <w:rFonts w:ascii="Times New Roman" w:hAnsi="Times New Roman" w:cs="Times New Roman"/>
-          <w:sz w:val="24"/>
-          <w:szCs w:val="24"/>
-        </w:rPr>
-      </w:pPr>
-    </w:p>
-    <w:p>
-      <w:pPr>
-        <w:pStyle w:val="HTMLPreformatted"/>
-        <w:rPr>
-          <w:rStyle w:val="HTMLCode"/>
-          <w:rFonts w:ascii="Times New Roman" w:hAnsi="Times New Roman" w:cs="Times New Roman"/>
-          <w:sz w:val="24"/>
-          <w:szCs w:val="24"/>
-        </w:rPr>
-      </w:pPr>
-      <w:r>
-        <w:rPr>
-          <w:rStyle w:val="HTMLCode"/>
-          <w:rFonts w:ascii="Times New Roman" w:hAnsi="Times New Roman" w:cs="Times New Roman"/>
-          <w:sz w:val="24"/>
-          <w:szCs w:val="24"/>
-        </w:rPr>
-        <w:t>Sve ostalo: OWNER read-only, osim ako MASTER eksplicitno ne dodeli permisiju.</w:t>
-      </w:r>
-    </w:p>
-    <w:p>
-      <w:pPr>
-        <w:pStyle w:val="HTMLPreformatted"/>
-        <w:rPr>
-          <w:rStyle w:val="HTMLCode"/>
-          <w:rFonts w:ascii="Times New Roman" w:hAnsi="Times New Roman" w:cs="Times New Roman"/>
-          <w:sz w:val="24"/>
-          <w:szCs w:val="24"/>
-        </w:rPr>
-      </w:pPr>
-    </w:p>
-    <w:p>
-      <w:pPr>
-        <w:pStyle w:val="HTMLPreformatted"/>
-        <w:rPr>
-          <w:rStyle w:val="HTMLCode"/>
-          <w:rFonts w:ascii="Times New Roman" w:hAnsi="Times New Roman" w:cs="Times New Roman"/>
-          <w:sz w:val="24"/>
-          <w:szCs w:val="24"/>
-        </w:rPr>
-      </w:pPr>
-      <w:r>
-        <w:rPr>
-          <w:rStyle w:val="HTMLCode"/>
-          <w:rFonts w:ascii="Times New Roman" w:hAnsi="Times New Roman" w:cs="Times New Roman"/>
-          <w:sz w:val="24"/>
-          <w:szCs w:val="24"/>
-        </w:rPr>
-        <w:t>Permission sistem mora biti granularan (section_key/item_key ili field-level po potrebi).</w:t>
-      </w:r>
-    </w:p>
-    <w:p>
-      <w:pPr>
-        <w:pStyle w:val="HTMLPreformatted"/>
-        <w:rPr>
-          <w:rStyle w:val="HTMLCode"/>
-          <w:rFonts w:ascii="Times New Roman" w:hAnsi="Times New Roman" w:cs="Times New Roman"/>
-          <w:sz w:val="24"/>
-          <w:szCs w:val="24"/>
-        </w:rPr>
-      </w:pPr>
-    </w:p>
-    <w:p>
-      <w:pPr>
-        <w:pStyle w:val="HTMLPreformatted"/>
-        <w:rPr>
-          <w:rStyle w:val="HTMLCode"/>
-          <w:rFonts w:ascii="Times New Roman" w:hAnsi="Times New Roman" w:cs="Times New Roman"/>
-          <w:sz w:val="24"/>
-          <w:szCs w:val="24"/>
-        </w:rPr>
-      </w:pPr>
-      <w:r>
-        <w:rPr>
-          <w:rStyle w:val="HTMLCode"/>
-          <w:rFonts w:ascii="Times New Roman" w:hAnsi="Times New Roman" w:cs="Times New Roman"/>
-          <w:sz w:val="24"/>
-          <w:szCs w:val="24"/>
-        </w:rPr>
-        <w:t>========================</w:t>
-      </w:r>
-    </w:p>
-    <w:p>
-      <w:pPr>
-        <w:pStyle w:val="HTMLPreformatted"/>
-        <w:rPr>
-          <w:rStyle w:val="HTMLCode"/>
-          <w:rFonts w:ascii="Times New Roman" w:hAnsi="Times New Roman" w:cs="Times New Roman"/>
-          <w:sz w:val="24"/>
-          <w:szCs w:val="24"/>
-        </w:rPr>
-      </w:pPr>
-      <w:r>
-        <w:rPr>
-          <w:rStyle w:val="HTMLCode"/>
-          <w:rFonts w:ascii="Times New Roman" w:hAnsi="Times New Roman" w:cs="Times New Roman"/>
-          <w:sz w:val="24"/>
-          <w:szCs w:val="24"/>
-        </w:rPr>
-        <w:t>D) PRIORITET OVERRIDE PRAVILO (OBAVEZNO)</w:t>
-      </w:r>
-    </w:p>
-    <w:p>
-      <w:pPr>
-        <w:pStyle w:val="HTMLPreformatted"/>
-        <w:rPr>
-          <w:rStyle w:val="HTMLCode"/>
-          <w:rFonts w:ascii="Times New Roman" w:hAnsi="Times New Roman" w:cs="Times New Roman"/>
-          <w:sz w:val="24"/>
-          <w:szCs w:val="24"/>
-        </w:rPr>
-      </w:pPr>
-      <w:r>
-        <w:rPr>
-          <w:rStyle w:val="HTMLCode"/>
-          <w:rFonts w:ascii="Times New Roman" w:hAnsi="Times New Roman" w:cs="Times New Roman"/>
-          <w:sz w:val="24"/>
-          <w:szCs w:val="24"/>
-        </w:rPr>
-        <w:t>tenant override &gt; global default:</w:t>
-      </w:r>
-    </w:p>
-    <w:p>
-      <w:pPr>
-        <w:pStyle w:val="HTMLPreformatted"/>
-        <w:rPr>
-          <w:rStyle w:val="HTMLCode"/>
-          <w:rFonts w:ascii="Times New Roman" w:hAnsi="Times New Roman" w:cs="Times New Roman"/>
-          <w:sz w:val="24"/>
-          <w:szCs w:val="24"/>
-        </w:rPr>
-      </w:pPr>
-      <w:r>
-        <w:rPr>
-          <w:rStyle w:val="HTMLCode"/>
-          <w:rFonts w:ascii="Times New Roman" w:hAnsi="Times New Roman" w:cs="Times New Roman"/>
-          <w:sz w:val="24"/>
-          <w:szCs w:val="24"/>
-        </w:rPr>
-        <w:t>- Ako postoji tenant item za isti section_key + item_key → koristi tenant verziju</w:t>
-      </w:r>
-    </w:p>
-    <w:p>
-      <w:pPr>
-        <w:pStyle w:val="HTMLPreformatted"/>
-        <w:rPr>
-          <w:rStyle w:val="HTMLCode"/>
-          <w:rFonts w:ascii="Times New Roman" w:hAnsi="Times New Roman" w:cs="Times New Roman"/>
-          <w:sz w:val="24"/>
-          <w:szCs w:val="24"/>
-        </w:rPr>
-      </w:pPr>
-      <w:r>
-        <w:rPr>
-          <w:rStyle w:val="HTMLCode"/>
-          <w:rFonts w:ascii="Times New Roman" w:hAnsi="Times New Roman" w:cs="Times New Roman"/>
-          <w:sz w:val="24"/>
-          <w:szCs w:val="24"/>
-        </w:rPr>
-        <w:t>- Inače koristi global (tenant_id NULL)</w:t>
-      </w:r>
-    </w:p>
-    <w:p>
-      <w:pPr>
-        <w:pStyle w:val="HTMLPreformatted"/>
-        <w:rPr>
-          <w:rStyle w:val="HTMLCode"/>
-          <w:rFonts w:ascii="Times New Roman" w:hAnsi="Times New Roman" w:cs="Times New Roman"/>
-          <w:sz w:val="24"/>
-          <w:szCs w:val="24"/>
-        </w:rPr>
-      </w:pPr>
-      <w:r>
-        <w:rPr>
-          <w:rStyle w:val="HTMLCode"/>
-          <w:rFonts w:ascii="Times New Roman" w:hAnsi="Times New Roman" w:cs="Times New Roman"/>
-          <w:sz w:val="24"/>
-          <w:szCs w:val="24"/>
-        </w:rPr>
-        <w:t>Isto važi za prevode (translations).</w:t>
-      </w:r>
-    </w:p>
-    <w:p>
-      <w:pPr>
-        <w:pStyle w:val="HTMLPreformatted"/>
-        <w:rPr>
-          <w:rStyle w:val="HTMLCode"/>
-          <w:rFonts w:ascii="Times New Roman" w:hAnsi="Times New Roman" w:cs="Times New Roman"/>
-          <w:sz w:val="24"/>
-          <w:szCs w:val="24"/>
-        </w:rPr>
-      </w:pPr>
-    </w:p>
-    <w:p>
-      <w:pPr>
-        <w:pStyle w:val="HTMLPreformatted"/>
-        <w:rPr>
-          <w:rStyle w:val="HTMLCode"/>
-          <w:rFonts w:ascii="Times New Roman" w:hAnsi="Times New Roman" w:cs="Times New Roman"/>
-          <w:sz w:val="24"/>
-          <w:szCs w:val="24"/>
-        </w:rPr>
-      </w:pPr>
-      <w:r>
-        <w:rPr>
-          <w:rStyle w:val="HTMLCode"/>
-          <w:rFonts w:ascii="Times New Roman" w:hAnsi="Times New Roman" w:cs="Times New Roman"/>
-          <w:sz w:val="24"/>
-          <w:szCs w:val="24"/>
-        </w:rPr>
-        <w:t>========================</w:t>
-      </w:r>
-    </w:p>
-    <w:p>
-      <w:pPr>
-        <w:pStyle w:val="HTMLPreformatted"/>
-        <w:rPr>
-          <w:rStyle w:val="HTMLCode"/>
-          <w:rFonts w:ascii="Times New Roman" w:hAnsi="Times New Roman" w:cs="Times New Roman"/>
-          <w:sz w:val="24"/>
-          <w:szCs w:val="24"/>
-        </w:rPr>
-      </w:pPr>
-      <w:r>
-        <w:rPr>
-          <w:rStyle w:val="HTMLCode"/>
-          <w:rFonts w:ascii="Times New Roman" w:hAnsi="Times New Roman" w:cs="Times New Roman"/>
-          <w:sz w:val="24"/>
-          <w:szCs w:val="24"/>
-        </w:rPr>
-        <w:t>E) CONTENT LOADER (SRCE SISTEMA)</w:t>
-      </w:r>
-    </w:p>
-    <w:p>
-      <w:pPr>
-        <w:pStyle w:val="HTMLPreformatted"/>
-        <w:rPr>
-          <w:rStyle w:val="HTMLCode"/>
-          <w:rFonts w:ascii="Times New Roman" w:hAnsi="Times New Roman" w:cs="Times New Roman"/>
-          <w:sz w:val="24"/>
-          <w:szCs w:val="24"/>
-        </w:rPr>
-      </w:pPr>
-      <w:r>
-        <w:rPr>
-          <w:rStyle w:val="HTMLCode"/>
-          <w:rFonts w:ascii="Times New Roman" w:hAnsi="Times New Roman" w:cs="Times New Roman"/>
-          <w:sz w:val="24"/>
-          <w:szCs w:val="24"/>
-        </w:rPr>
-        <w:t>Uvesti jedinstven API sloj (može prvo JSON/localStorage, kasnije DB):</w:t>
-      </w:r>
-    </w:p>
-    <w:p>
-      <w:pPr>
-        <w:pStyle w:val="HTMLPreformatted"/>
-        <w:rPr>
-          <w:rStyle w:val="HTMLCode"/>
-          <w:rFonts w:ascii="Times New Roman" w:hAnsi="Times New Roman" w:cs="Times New Roman"/>
-          <w:sz w:val="24"/>
-          <w:szCs w:val="24"/>
-        </w:rPr>
-      </w:pPr>
-      <w:r>
-        <w:rPr>
-          <w:rStyle w:val="HTMLCode"/>
-          <w:rFonts w:ascii="Times New Roman" w:hAnsi="Times New Roman" w:cs="Times New Roman"/>
-          <w:sz w:val="24"/>
-          <w:szCs w:val="24"/>
-        </w:rPr>
-        <w:t>- getConfig(tenant_id)</w:t>
-      </w:r>
-    </w:p>
-    <w:p>
-      <w:pPr>
-        <w:pStyle w:val="HTMLPreformatted"/>
-        <w:rPr>
-          <w:rStyle w:val="HTMLCode"/>
-          <w:rFonts w:ascii="Times New Roman" w:hAnsi="Times New Roman" w:cs="Times New Roman"/>
-          <w:sz w:val="24"/>
-          <w:szCs w:val="24"/>
-        </w:rPr>
-      </w:pPr>
-      <w:r>
-        <w:rPr>
-          <w:rStyle w:val="HTMLCode"/>
-          <w:rFonts w:ascii="Times New Roman" w:hAnsi="Times New Roman" w:cs="Times New Roman"/>
-          <w:sz w:val="24"/>
-          <w:szCs w:val="24"/>
-        </w:rPr>
-        <w:t>- getSections(tenant_id)</w:t>
-      </w:r>
-    </w:p>
-    <w:p>
-      <w:pPr>
-        <w:pStyle w:val="HTMLPreformatted"/>
-        <w:rPr>
-          <w:rStyle w:val="HTMLCode"/>
-          <w:rFonts w:ascii="Times New Roman" w:hAnsi="Times New Roman" w:cs="Times New Roman"/>
-          <w:sz w:val="24"/>
-          <w:szCs w:val="24"/>
-        </w:rPr>
-      </w:pPr>
-      <w:r>
-        <w:rPr>
-          <w:rStyle w:val="HTMLCode"/>
-          <w:rFonts w:ascii="Times New Roman" w:hAnsi="Times New Roman" w:cs="Times New Roman"/>
-          <w:sz w:val="24"/>
-          <w:szCs w:val="24"/>
-        </w:rPr>
-        <w:t>- getItems(section_key, tenant_id)</w:t>
-      </w:r>
-    </w:p>
-    <w:p>
-      <w:pPr>
-        <w:pStyle w:val="HTMLPreformatted"/>
-        <w:rPr>
-          <w:rStyle w:val="HTMLCode"/>
-          <w:rFonts w:ascii="Times New Roman" w:hAnsi="Times New Roman" w:cs="Times New Roman"/>
-          <w:sz w:val="24"/>
-          <w:szCs w:val="24"/>
-        </w:rPr>
-      </w:pPr>
-      <w:r>
-        <w:rPr>
-          <w:rStyle w:val="HTMLCode"/>
-          <w:rFonts w:ascii="Times New Roman" w:hAnsi="Times New Roman" w:cs="Times New Roman"/>
-          <w:sz w:val="24"/>
-          <w:szCs w:val="24"/>
-        </w:rPr>
-        <w:t>- getParkingPublic(town)</w:t>
-      </w:r>
-    </w:p>
-    <w:p>
-      <w:pPr>
-        <w:pStyle w:val="HTMLPreformatted"/>
-        <w:rPr>
-          <w:rStyle w:val="HTMLCode"/>
-          <w:rFonts w:ascii="Times New Roman" w:hAnsi="Times New Roman" w:cs="Times New Roman"/>
-          <w:sz w:val="24"/>
-          <w:szCs w:val="24"/>
-        </w:rPr>
-      </w:pPr>
-      <w:r>
-        <w:rPr>
-          <w:rStyle w:val="HTMLCode"/>
-          <w:rFonts w:ascii="Times New Roman" w:hAnsi="Times New Roman" w:cs="Times New Roman"/>
-          <w:sz w:val="24"/>
-          <w:szCs w:val="24"/>
-        </w:rPr>
-        <w:t>- getParkingPrivate(tenant_id)</w:t>
-      </w:r>
-    </w:p>
-    <w:p>
-      <w:pPr>
-        <w:pStyle w:val="HTMLPreformatted"/>
-        <w:rPr>
-          <w:rStyle w:val="HTMLCode"/>
-          <w:rFonts w:ascii="Times New Roman" w:hAnsi="Times New Roman" w:cs="Times New Roman"/>
-          <w:sz w:val="24"/>
-          <w:szCs w:val="24"/>
-        </w:rPr>
-      </w:pPr>
-      <w:r>
-        <w:rPr>
-          <w:rStyle w:val="HTMLCode"/>
-          <w:rFonts w:ascii="Times New Roman" w:hAnsi="Times New Roman" w:cs="Times New Roman"/>
-          <w:sz w:val="24"/>
-          <w:szCs w:val="24"/>
-        </w:rPr>
-        <w:t>- getTranslations(lang, tenant_id)</w:t>
-      </w:r>
-    </w:p>
-    <w:p>
-      <w:pPr>
-        <w:pStyle w:val="HTMLPreformatted"/>
-        <w:rPr>
-          <w:rStyle w:val="HTMLCode"/>
-          <w:rFonts w:ascii="Times New Roman" w:hAnsi="Times New Roman" w:cs="Times New Roman"/>
-          <w:sz w:val="24"/>
-          <w:szCs w:val="24"/>
-        </w:rPr>
-      </w:pPr>
-    </w:p>
-    <w:p>
-      <w:pPr>
-        <w:pStyle w:val="HTMLPreformatted"/>
-        <w:rPr>
-          <w:rStyle w:val="HTMLCode"/>
-          <w:rFonts w:ascii="Times New Roman" w:hAnsi="Times New Roman" w:cs="Times New Roman"/>
-          <w:sz w:val="24"/>
-          <w:szCs w:val="24"/>
-        </w:rPr>
-      </w:pPr>
-      <w:r>
-        <w:rPr>
-          <w:rStyle w:val="HTMLCode"/>
-          <w:rFonts w:ascii="Times New Roman" w:hAnsi="Times New Roman" w:cs="Times New Roman"/>
-          <w:sz w:val="24"/>
-          <w:szCs w:val="24"/>
-        </w:rPr>
-        <w:t>Cilj: postojeće render funkcije u app.js ostaju, samo umesto hardcoded/const čitaju preko loader-a.</w:t>
       </w:r>
     </w:p>
     <w:p>
@@ -1542,6 +749,903 @@
           <w:sz w:val="24"/>
           <w:szCs w:val="24"/>
         </w:rPr>
+        <w:t>B) CILJ (SaaS)</w:t>
+      </w:r>
+    </w:p>
+    <w:p>
+      <w:pPr>
+        <w:pStyle w:val="HTMLPreformatted"/>
+        <w:rPr>
+          <w:rStyle w:val="HTMLCode"/>
+          <w:rFonts w:ascii="Times New Roman" w:hAnsi="Times New Roman" w:cs="Times New Roman"/>
+          <w:sz w:val="24"/>
+          <w:szCs w:val="24"/>
+        </w:rPr>
+      </w:pPr>
+      <w:r>
+        <w:rPr>
+          <w:rStyle w:val="HTMLCode"/>
+          <w:rFonts w:ascii="Times New Roman" w:hAnsi="Times New Roman" w:cs="Times New Roman"/>
+          <w:sz w:val="24"/>
+          <w:szCs w:val="24"/>
+        </w:rPr>
+        <w:t>1) Multi-tenant: jedan kod, više apartmana (tenants). Svaki tenant može imati override sadržaja.</w:t>
+      </w:r>
+    </w:p>
+    <w:p>
+      <w:pPr>
+        <w:pStyle w:val="HTMLPreformatted"/>
+        <w:rPr>
+          <w:rStyle w:val="HTMLCode"/>
+          <w:rFonts w:ascii="Times New Roman" w:hAnsi="Times New Roman" w:cs="Times New Roman"/>
+          <w:sz w:val="24"/>
+          <w:szCs w:val="24"/>
+        </w:rPr>
+      </w:pPr>
+      <w:r>
+        <w:rPr>
+          <w:rStyle w:val="HTMLCode"/>
+          <w:rFonts w:ascii="Times New Roman" w:hAnsi="Times New Roman" w:cs="Times New Roman"/>
+          <w:sz w:val="24"/>
+          <w:szCs w:val="24"/>
+        </w:rPr>
+        <w:t>2) Dve uloge:</w:t>
+      </w:r>
+    </w:p>
+    <w:p>
+      <w:pPr>
+        <w:pStyle w:val="HTMLPreformatted"/>
+        <w:rPr>
+          <w:rStyle w:val="HTMLCode"/>
+          <w:rFonts w:ascii="Times New Roman" w:hAnsi="Times New Roman" w:cs="Times New Roman"/>
+          <w:sz w:val="24"/>
+          <w:szCs w:val="24"/>
+        </w:rPr>
+      </w:pPr>
+      <w:r>
+        <w:rPr>
+          <w:rStyle w:val="HTMLCode"/>
+          <w:rFonts w:ascii="Times New Roman" w:hAnsi="Times New Roman" w:cs="Times New Roman"/>
+          <w:sz w:val="24"/>
+          <w:szCs w:val="24"/>
+        </w:rPr>
+        <w:t xml:space="preserve">   - MASTER: sve (global content, layout, parking public, translations, permissions, tenants/users)</w:t>
+      </w:r>
+    </w:p>
+    <w:p>
+      <w:pPr>
+        <w:pStyle w:val="HTMLPreformatted"/>
+        <w:rPr>
+          <w:rStyle w:val="HTMLCode"/>
+          <w:rFonts w:ascii="Times New Roman" w:hAnsi="Times New Roman" w:cs="Times New Roman"/>
+          <w:sz w:val="24"/>
+          <w:szCs w:val="24"/>
+        </w:rPr>
+      </w:pPr>
+      <w:r>
+        <w:rPr>
+          <w:rStyle w:val="HTMLCode"/>
+          <w:rFonts w:ascii="Times New Roman" w:hAnsi="Times New Roman" w:cs="Times New Roman"/>
+          <w:sz w:val="24"/>
+          <w:szCs w:val="24"/>
+        </w:rPr>
+        <w:t xml:space="preserve">   - OWNER: samo svoj tenant, i samo ono što mu MASTER dozvoli</w:t>
+      </w:r>
+    </w:p>
+    <w:p>
+      <w:pPr>
+        <w:pStyle w:val="HTMLPreformatted"/>
+        <w:rPr>
+          <w:rStyle w:val="HTMLCode"/>
+          <w:rFonts w:ascii="Times New Roman" w:hAnsi="Times New Roman" w:cs="Times New Roman"/>
+          <w:sz w:val="24"/>
+          <w:szCs w:val="24"/>
+        </w:rPr>
+      </w:pPr>
+      <w:r>
+        <w:rPr>
+          <w:rStyle w:val="HTMLCode"/>
+          <w:rFonts w:ascii="Times New Roman" w:hAnsi="Times New Roman" w:cs="Times New Roman"/>
+          <w:sz w:val="24"/>
+          <w:szCs w:val="24"/>
+        </w:rPr>
+        <w:t>3) Sve dinamično:</w:t>
+      </w:r>
+    </w:p>
+    <w:p>
+      <w:pPr>
+        <w:pStyle w:val="HTMLPreformatted"/>
+        <w:rPr>
+          <w:rStyle w:val="HTMLCode"/>
+          <w:rFonts w:ascii="Times New Roman" w:hAnsi="Times New Roman" w:cs="Times New Roman"/>
+          <w:sz w:val="24"/>
+          <w:szCs w:val="24"/>
+        </w:rPr>
+      </w:pPr>
+      <w:r>
+        <w:rPr>
+          <w:rStyle w:val="HTMLCode"/>
+          <w:rFonts w:ascii="Times New Roman" w:hAnsi="Times New Roman" w:cs="Times New Roman"/>
+          <w:sz w:val="24"/>
+          <w:szCs w:val="24"/>
+        </w:rPr>
+        <w:t xml:space="preserve">   - svaka kartica/sekcija mora podržati add/edit/hide/reorder stavki bez deploy-a</w:t>
+      </w:r>
+    </w:p>
+    <w:p>
+      <w:pPr>
+        <w:pStyle w:val="HTMLPreformatted"/>
+        <w:rPr>
+          <w:rStyle w:val="HTMLCode"/>
+          <w:rFonts w:ascii="Times New Roman" w:hAnsi="Times New Roman" w:cs="Times New Roman"/>
+          <w:sz w:val="24"/>
+          <w:szCs w:val="24"/>
+        </w:rPr>
+      </w:pPr>
+      <w:r>
+        <w:rPr>
+          <w:rStyle w:val="HTMLCode"/>
+          <w:rFonts w:ascii="Times New Roman" w:hAnsi="Times New Roman" w:cs="Times New Roman"/>
+          <w:sz w:val="24"/>
+          <w:szCs w:val="24"/>
+        </w:rPr>
+        <w:t xml:space="preserve">   - vidljivost sekcija i redosled kartica admin-kontrolisani</w:t>
+      </w:r>
+    </w:p>
+    <w:p>
+      <w:pPr>
+        <w:pStyle w:val="HTMLPreformatted"/>
+        <w:rPr>
+          <w:rStyle w:val="HTMLCode"/>
+          <w:rFonts w:ascii="Times New Roman" w:hAnsi="Times New Roman" w:cs="Times New Roman"/>
+          <w:sz w:val="24"/>
+          <w:szCs w:val="24"/>
+        </w:rPr>
+      </w:pPr>
+      <w:r>
+        <w:rPr>
+          <w:rStyle w:val="HTMLCode"/>
+          <w:rFonts w:ascii="Times New Roman" w:hAnsi="Times New Roman" w:cs="Times New Roman"/>
+          <w:sz w:val="24"/>
+          <w:szCs w:val="24"/>
+        </w:rPr>
+        <w:t>4) Parking:</w:t>
+      </w:r>
+    </w:p>
+    <w:p>
+      <w:pPr>
+        <w:pStyle w:val="HTMLPreformatted"/>
+        <w:rPr>
+          <w:rStyle w:val="HTMLCode"/>
+          <w:rFonts w:ascii="Times New Roman" w:hAnsi="Times New Roman" w:cs="Times New Roman"/>
+          <w:sz w:val="24"/>
+          <w:szCs w:val="24"/>
+        </w:rPr>
+      </w:pPr>
+      <w:r>
+        <w:rPr>
+          <w:rStyle w:val="HTMLCode"/>
+          <w:rFonts w:ascii="Times New Roman" w:hAnsi="Times New Roman" w:cs="Times New Roman"/>
+          <w:sz w:val="24"/>
+          <w:szCs w:val="24"/>
+        </w:rPr>
+        <w:t xml:space="preserve">   - PUBLIC parking (global, master editable) + filter po town (kao sada)</w:t>
+      </w:r>
+    </w:p>
+    <w:p>
+      <w:pPr>
+        <w:pStyle w:val="HTMLPreformatted"/>
+        <w:rPr>
+          <w:rStyle w:val="HTMLCode"/>
+          <w:rFonts w:ascii="Times New Roman" w:hAnsi="Times New Roman" w:cs="Times New Roman"/>
+          <w:sz w:val="24"/>
+          <w:szCs w:val="24"/>
+        </w:rPr>
+      </w:pPr>
+      <w:r>
+        <w:rPr>
+          <w:rStyle w:val="HTMLCode"/>
+          <w:rFonts w:ascii="Times New Roman" w:hAnsi="Times New Roman" w:cs="Times New Roman"/>
+          <w:sz w:val="24"/>
+          <w:szCs w:val="24"/>
+        </w:rPr>
+        <w:t xml:space="preserve">   - PRIVATE parking (tenant scoped, owner editable)</w:t>
+      </w:r>
+    </w:p>
+    <w:p>
+      <w:pPr>
+        <w:pStyle w:val="HTMLPreformatted"/>
+        <w:rPr>
+          <w:rStyle w:val="HTMLCode"/>
+          <w:rFonts w:ascii="Times New Roman" w:hAnsi="Times New Roman" w:cs="Times New Roman"/>
+          <w:sz w:val="24"/>
+          <w:szCs w:val="24"/>
+        </w:rPr>
+      </w:pPr>
+      <w:r>
+        <w:rPr>
+          <w:rStyle w:val="HTMLCode"/>
+          <w:rFonts w:ascii="Times New Roman" w:hAnsi="Times New Roman" w:cs="Times New Roman"/>
+          <w:sz w:val="24"/>
+          <w:szCs w:val="24"/>
+        </w:rPr>
+        <w:t xml:space="preserve">   - zadržati assets/data/parking folder kao fallback/seed dok DB ne bude uveden</w:t>
+      </w:r>
+    </w:p>
+    <w:p>
+      <w:pPr>
+        <w:pStyle w:val="HTMLPreformatted"/>
+        <w:rPr>
+          <w:rStyle w:val="HTMLCode"/>
+          <w:rFonts w:ascii="Times New Roman" w:hAnsi="Times New Roman" w:cs="Times New Roman"/>
+          <w:sz w:val="24"/>
+          <w:szCs w:val="24"/>
+        </w:rPr>
+      </w:pPr>
+    </w:p>
+    <w:p>
+      <w:pPr>
+        <w:pStyle w:val="HTMLPreformatted"/>
+        <w:rPr>
+          <w:rStyle w:val="HTMLCode"/>
+          <w:rFonts w:ascii="Times New Roman" w:hAnsi="Times New Roman" w:cs="Times New Roman"/>
+          <w:sz w:val="24"/>
+          <w:szCs w:val="24"/>
+        </w:rPr>
+      </w:pPr>
+      <w:r>
+        <w:rPr>
+          <w:rStyle w:val="HTMLCode"/>
+          <w:rFonts w:ascii="Times New Roman" w:hAnsi="Times New Roman" w:cs="Times New Roman"/>
+          <w:sz w:val="24"/>
+          <w:szCs w:val="24"/>
+        </w:rPr>
+        <w:t>========================</w:t>
+      </w:r>
+    </w:p>
+    <w:p>
+      <w:pPr>
+        <w:pStyle w:val="HTMLPreformatted"/>
+        <w:rPr>
+          <w:rStyle w:val="HTMLCode"/>
+          <w:rFonts w:ascii="Times New Roman" w:hAnsi="Times New Roman" w:cs="Times New Roman"/>
+          <w:sz w:val="24"/>
+          <w:szCs w:val="24"/>
+        </w:rPr>
+      </w:pPr>
+      <w:r>
+        <w:rPr>
+          <w:rStyle w:val="HTMLCode"/>
+          <w:rFonts w:ascii="Times New Roman" w:hAnsi="Times New Roman" w:cs="Times New Roman"/>
+          <w:sz w:val="24"/>
+          <w:szCs w:val="24"/>
+        </w:rPr>
+        <w:t>C) PERMISIJЕ (DEFAULT)</w:t>
+      </w:r>
+    </w:p>
+    <w:p>
+      <w:pPr>
+        <w:pStyle w:val="HTMLPreformatted"/>
+        <w:rPr>
+          <w:rStyle w:val="HTMLCode"/>
+          <w:rFonts w:ascii="Times New Roman" w:hAnsi="Times New Roman" w:cs="Times New Roman"/>
+          <w:sz w:val="24"/>
+          <w:szCs w:val="24"/>
+        </w:rPr>
+      </w:pPr>
+      <w:r>
+        <w:rPr>
+          <w:rStyle w:val="HTMLCode"/>
+          <w:rFonts w:ascii="Times New Roman" w:hAnsi="Times New Roman" w:cs="Times New Roman"/>
+          <w:sz w:val="24"/>
+          <w:szCs w:val="24"/>
+        </w:rPr>
+        <w:t>MASTER:</w:t>
+      </w:r>
+    </w:p>
+    <w:p>
+      <w:pPr>
+        <w:pStyle w:val="HTMLPreformatted"/>
+        <w:rPr>
+          <w:rStyle w:val="HTMLCode"/>
+          <w:rFonts w:ascii="Times New Roman" w:hAnsi="Times New Roman" w:cs="Times New Roman"/>
+          <w:sz w:val="24"/>
+          <w:szCs w:val="24"/>
+        </w:rPr>
+      </w:pPr>
+      <w:r>
+        <w:rPr>
+          <w:rStyle w:val="HTMLCode"/>
+          <w:rFonts w:ascii="Times New Roman" w:hAnsi="Times New Roman" w:cs="Times New Roman"/>
+          <w:sz w:val="24"/>
+          <w:szCs w:val="24"/>
+        </w:rPr>
+        <w:t>- edit sve</w:t>
+      </w:r>
+    </w:p>
+    <w:p>
+      <w:pPr>
+        <w:pStyle w:val="HTMLPreformatted"/>
+        <w:rPr>
+          <w:rStyle w:val="HTMLCode"/>
+          <w:rFonts w:ascii="Times New Roman" w:hAnsi="Times New Roman" w:cs="Times New Roman"/>
+          <w:sz w:val="24"/>
+          <w:szCs w:val="24"/>
+        </w:rPr>
+      </w:pPr>
+      <w:r>
+        <w:rPr>
+          <w:rStyle w:val="HTMLCode"/>
+          <w:rFonts w:ascii="Times New Roman" w:hAnsi="Times New Roman" w:cs="Times New Roman"/>
+          <w:sz w:val="24"/>
+          <w:szCs w:val="24"/>
+        </w:rPr>
+        <w:t>OWNER default može edit:</w:t>
+      </w:r>
+    </w:p>
+    <w:p>
+      <w:pPr>
+        <w:pStyle w:val="HTMLPreformatted"/>
+        <w:rPr>
+          <w:rStyle w:val="HTMLCode"/>
+          <w:rFonts w:ascii="Times New Roman" w:hAnsi="Times New Roman" w:cs="Times New Roman"/>
+          <w:sz w:val="24"/>
+          <w:szCs w:val="24"/>
+        </w:rPr>
+      </w:pPr>
+      <w:r>
+        <w:rPr>
+          <w:rStyle w:val="HTMLCode"/>
+          <w:rFonts w:ascii="Times New Roman" w:hAnsi="Times New Roman" w:cs="Times New Roman"/>
+          <w:sz w:val="24"/>
+          <w:szCs w:val="24"/>
+        </w:rPr>
+        <w:t>- apartment_name</w:t>
+      </w:r>
+    </w:p>
+    <w:p>
+      <w:pPr>
+        <w:pStyle w:val="HTMLPreformatted"/>
+        <w:rPr>
+          <w:rStyle w:val="HTMLCode"/>
+          <w:rFonts w:ascii="Times New Roman" w:hAnsi="Times New Roman" w:cs="Times New Roman"/>
+          <w:sz w:val="24"/>
+          <w:szCs w:val="24"/>
+        </w:rPr>
+      </w:pPr>
+      <w:r>
+        <w:rPr>
+          <w:rStyle w:val="HTMLCode"/>
+          <w:rFonts w:ascii="Times New Roman" w:hAnsi="Times New Roman" w:cs="Times New Roman"/>
+          <w:sz w:val="24"/>
+          <w:szCs w:val="24"/>
+        </w:rPr>
+        <w:t>- owner_phone (i opcionalno whatsapp ako postoji)</w:t>
+      </w:r>
+    </w:p>
+    <w:p>
+      <w:pPr>
+        <w:pStyle w:val="HTMLPreformatted"/>
+        <w:rPr>
+          <w:rStyle w:val="HTMLCode"/>
+          <w:rFonts w:ascii="Times New Roman" w:hAnsi="Times New Roman" w:cs="Times New Roman"/>
+          <w:sz w:val="24"/>
+          <w:szCs w:val="24"/>
+        </w:rPr>
+      </w:pPr>
+      <w:r>
+        <w:rPr>
+          <w:rStyle w:val="HTMLCode"/>
+          <w:rFonts w:ascii="Times New Roman" w:hAnsi="Times New Roman" w:cs="Times New Roman"/>
+          <w:sz w:val="24"/>
+          <w:szCs w:val="24"/>
+        </w:rPr>
+        <w:t>- apartment_navigation_link (npr. directions/maps link do apartmana ili link do pravila)</w:t>
+      </w:r>
+    </w:p>
+    <w:p>
+      <w:pPr>
+        <w:pStyle w:val="HTMLPreformatted"/>
+        <w:rPr>
+          <w:rStyle w:val="HTMLCode"/>
+          <w:rFonts w:ascii="Times New Roman" w:hAnsi="Times New Roman" w:cs="Times New Roman"/>
+          <w:sz w:val="24"/>
+          <w:szCs w:val="24"/>
+        </w:rPr>
+      </w:pPr>
+      <w:r>
+        <w:rPr>
+          <w:rStyle w:val="HTMLCode"/>
+          <w:rFonts w:ascii="Times New Roman" w:hAnsi="Times New Roman" w:cs="Times New Roman"/>
+          <w:sz w:val="24"/>
+          <w:szCs w:val="24"/>
+        </w:rPr>
+        <w:t>- private_house_rules (tenant-specific)</w:t>
+      </w:r>
+    </w:p>
+    <w:p>
+      <w:pPr>
+        <w:pStyle w:val="HTMLPreformatted"/>
+        <w:rPr>
+          <w:rStyle w:val="HTMLCode"/>
+          <w:rFonts w:ascii="Times New Roman" w:hAnsi="Times New Roman" w:cs="Times New Roman"/>
+          <w:sz w:val="24"/>
+          <w:szCs w:val="24"/>
+        </w:rPr>
+      </w:pPr>
+      <w:r>
+        <w:rPr>
+          <w:rStyle w:val="HTMLCode"/>
+          <w:rFonts w:ascii="Times New Roman" w:hAnsi="Times New Roman" w:cs="Times New Roman"/>
+          <w:sz w:val="24"/>
+          <w:szCs w:val="24"/>
+        </w:rPr>
+        <w:t>- private_parking (tenant-specific)</w:t>
+      </w:r>
+    </w:p>
+    <w:p>
+      <w:pPr>
+        <w:pStyle w:val="HTMLPreformatted"/>
+        <w:rPr>
+          <w:rStyle w:val="HTMLCode"/>
+          <w:rFonts w:ascii="Times New Roman" w:hAnsi="Times New Roman" w:cs="Times New Roman"/>
+          <w:sz w:val="24"/>
+          <w:szCs w:val="24"/>
+        </w:rPr>
+      </w:pPr>
+    </w:p>
+    <w:p>
+      <w:pPr>
+        <w:pStyle w:val="HTMLPreformatted"/>
+        <w:rPr>
+          <w:rStyle w:val="HTMLCode"/>
+          <w:rFonts w:ascii="Times New Roman" w:hAnsi="Times New Roman" w:cs="Times New Roman"/>
+          <w:sz w:val="24"/>
+          <w:szCs w:val="24"/>
+        </w:rPr>
+      </w:pPr>
+      <w:r>
+        <w:rPr>
+          <w:rStyle w:val="HTMLCode"/>
+          <w:rFonts w:ascii="Times New Roman" w:hAnsi="Times New Roman" w:cs="Times New Roman"/>
+          <w:sz w:val="24"/>
+          <w:szCs w:val="24"/>
+        </w:rPr>
+        <w:t>Sve ostalo: OWNER read-only, osim ako MASTER eksplicitno ne dodeli permisiju.</w:t>
+      </w:r>
+    </w:p>
+    <w:p>
+      <w:pPr>
+        <w:pStyle w:val="HTMLPreformatted"/>
+        <w:rPr>
+          <w:rStyle w:val="HTMLCode"/>
+          <w:rFonts w:ascii="Times New Roman" w:hAnsi="Times New Roman" w:cs="Times New Roman"/>
+          <w:sz w:val="24"/>
+          <w:szCs w:val="24"/>
+        </w:rPr>
+      </w:pPr>
+    </w:p>
+    <w:p>
+      <w:pPr>
+        <w:pStyle w:val="HTMLPreformatted"/>
+        <w:rPr>
+          <w:rStyle w:val="HTMLCode"/>
+          <w:rFonts w:ascii="Times New Roman" w:hAnsi="Times New Roman" w:cs="Times New Roman"/>
+          <w:sz w:val="24"/>
+          <w:szCs w:val="24"/>
+        </w:rPr>
+      </w:pPr>
+      <w:r>
+        <w:rPr>
+          <w:rStyle w:val="HTMLCode"/>
+          <w:rFonts w:ascii="Times New Roman" w:hAnsi="Times New Roman" w:cs="Times New Roman"/>
+          <w:sz w:val="24"/>
+          <w:szCs w:val="24"/>
+        </w:rPr>
+        <w:t>Permission sistem mora biti granularan (section_key/item_key ili field-level po potrebi).</w:t>
+      </w:r>
+    </w:p>
+    <w:p>
+      <w:pPr>
+        <w:pStyle w:val="HTMLPreformatted"/>
+        <w:rPr>
+          <w:rStyle w:val="HTMLCode"/>
+          <w:rFonts w:ascii="Times New Roman" w:hAnsi="Times New Roman" w:cs="Times New Roman"/>
+          <w:sz w:val="24"/>
+          <w:szCs w:val="24"/>
+        </w:rPr>
+      </w:pPr>
+    </w:p>
+    <w:p>
+      <w:pPr>
+        <w:pStyle w:val="HTMLPreformatted"/>
+        <w:rPr>
+          <w:rStyle w:val="HTMLCode"/>
+          <w:rFonts w:ascii="Times New Roman" w:hAnsi="Times New Roman" w:cs="Times New Roman"/>
+          <w:sz w:val="24"/>
+          <w:szCs w:val="24"/>
+        </w:rPr>
+      </w:pPr>
+      <w:r>
+        <w:rPr>
+          <w:rStyle w:val="HTMLCode"/>
+          <w:rFonts w:ascii="Times New Roman" w:hAnsi="Times New Roman" w:cs="Times New Roman"/>
+          <w:sz w:val="24"/>
+          <w:szCs w:val="24"/>
+        </w:rPr>
+        <w:t>========================</w:t>
+      </w:r>
+    </w:p>
+    <w:p>
+      <w:pPr>
+        <w:pStyle w:val="HTMLPreformatted"/>
+        <w:rPr>
+          <w:rStyle w:val="HTMLCode"/>
+          <w:rFonts w:ascii="Times New Roman" w:hAnsi="Times New Roman" w:cs="Times New Roman"/>
+          <w:sz w:val="24"/>
+          <w:szCs w:val="24"/>
+        </w:rPr>
+      </w:pPr>
+      <w:r>
+        <w:rPr>
+          <w:rStyle w:val="HTMLCode"/>
+          <w:rFonts w:ascii="Times New Roman" w:hAnsi="Times New Roman" w:cs="Times New Roman"/>
+          <w:sz w:val="24"/>
+          <w:szCs w:val="24"/>
+        </w:rPr>
+        <w:t>D) PRIORITET OVERRIDE PRAVILO (OBAVEZNO)</w:t>
+      </w:r>
+    </w:p>
+    <w:p>
+      <w:pPr>
+        <w:pStyle w:val="HTMLPreformatted"/>
+        <w:rPr>
+          <w:rStyle w:val="HTMLCode"/>
+          <w:rFonts w:ascii="Times New Roman" w:hAnsi="Times New Roman" w:cs="Times New Roman"/>
+          <w:sz w:val="24"/>
+          <w:szCs w:val="24"/>
+        </w:rPr>
+      </w:pPr>
+      <w:r>
+        <w:rPr>
+          <w:rStyle w:val="HTMLCode"/>
+          <w:rFonts w:ascii="Times New Roman" w:hAnsi="Times New Roman" w:cs="Times New Roman"/>
+          <w:sz w:val="24"/>
+          <w:szCs w:val="24"/>
+        </w:rPr>
+        <w:t>tenant override &gt; global default:</w:t>
+      </w:r>
+    </w:p>
+    <w:p>
+      <w:pPr>
+        <w:pStyle w:val="HTMLPreformatted"/>
+        <w:rPr>
+          <w:rStyle w:val="HTMLCode"/>
+          <w:rFonts w:ascii="Times New Roman" w:hAnsi="Times New Roman" w:cs="Times New Roman"/>
+          <w:sz w:val="24"/>
+          <w:szCs w:val="24"/>
+        </w:rPr>
+      </w:pPr>
+      <w:r>
+        <w:rPr>
+          <w:rStyle w:val="HTMLCode"/>
+          <w:rFonts w:ascii="Times New Roman" w:hAnsi="Times New Roman" w:cs="Times New Roman"/>
+          <w:sz w:val="24"/>
+          <w:szCs w:val="24"/>
+        </w:rPr>
+        <w:t>- Ako postoji tenant item za isti section_key + item_key → koristi tenant verziju</w:t>
+      </w:r>
+    </w:p>
+    <w:p>
+      <w:pPr>
+        <w:pStyle w:val="HTMLPreformatted"/>
+        <w:rPr>
+          <w:rStyle w:val="HTMLCode"/>
+          <w:rFonts w:ascii="Times New Roman" w:hAnsi="Times New Roman" w:cs="Times New Roman"/>
+          <w:sz w:val="24"/>
+          <w:szCs w:val="24"/>
+        </w:rPr>
+      </w:pPr>
+      <w:r>
+        <w:rPr>
+          <w:rStyle w:val="HTMLCode"/>
+          <w:rFonts w:ascii="Times New Roman" w:hAnsi="Times New Roman" w:cs="Times New Roman"/>
+          <w:sz w:val="24"/>
+          <w:szCs w:val="24"/>
+        </w:rPr>
+        <w:t>- Inače koristi global (tenant_id NULL)</w:t>
+      </w:r>
+    </w:p>
+    <w:p>
+      <w:pPr>
+        <w:pStyle w:val="HTMLPreformatted"/>
+        <w:rPr>
+          <w:rStyle w:val="HTMLCode"/>
+          <w:rFonts w:ascii="Times New Roman" w:hAnsi="Times New Roman" w:cs="Times New Roman"/>
+          <w:sz w:val="24"/>
+          <w:szCs w:val="24"/>
+        </w:rPr>
+      </w:pPr>
+      <w:r>
+        <w:rPr>
+          <w:rStyle w:val="HTMLCode"/>
+          <w:rFonts w:ascii="Times New Roman" w:hAnsi="Times New Roman" w:cs="Times New Roman"/>
+          <w:sz w:val="24"/>
+          <w:szCs w:val="24"/>
+        </w:rPr>
+        <w:t>Isto važi za prevode (translations).</w:t>
+      </w:r>
+    </w:p>
+    <w:p>
+      <w:pPr>
+        <w:pStyle w:val="HTMLPreformatted"/>
+        <w:rPr>
+          <w:rStyle w:val="HTMLCode"/>
+          <w:rFonts w:ascii="Times New Roman" w:hAnsi="Times New Roman" w:cs="Times New Roman"/>
+          <w:sz w:val="24"/>
+          <w:szCs w:val="24"/>
+        </w:rPr>
+      </w:pPr>
+    </w:p>
+    <w:p>
+      <w:pPr>
+        <w:pStyle w:val="HTMLPreformatted"/>
+        <w:rPr>
+          <w:rStyle w:val="HTMLCode"/>
+          <w:rFonts w:ascii="Times New Roman" w:hAnsi="Times New Roman" w:cs="Times New Roman"/>
+          <w:sz w:val="24"/>
+          <w:szCs w:val="24"/>
+        </w:rPr>
+      </w:pPr>
+      <w:r>
+        <w:rPr>
+          <w:rStyle w:val="HTMLCode"/>
+          <w:rFonts w:ascii="Times New Roman" w:hAnsi="Times New Roman" w:cs="Times New Roman"/>
+          <w:sz w:val="24"/>
+          <w:szCs w:val="24"/>
+        </w:rPr>
+        <w:t>========================</w:t>
+      </w:r>
+    </w:p>
+    <w:p>
+      <w:pPr>
+        <w:pStyle w:val="HTMLPreformatted"/>
+        <w:rPr>
+          <w:rStyle w:val="HTMLCode"/>
+          <w:rFonts w:ascii="Times New Roman" w:hAnsi="Times New Roman" w:cs="Times New Roman"/>
+          <w:sz w:val="24"/>
+          <w:szCs w:val="24"/>
+        </w:rPr>
+      </w:pPr>
+      <w:r>
+        <w:rPr>
+          <w:rStyle w:val="HTMLCode"/>
+          <w:rFonts w:ascii="Times New Roman" w:hAnsi="Times New Roman" w:cs="Times New Roman"/>
+          <w:sz w:val="24"/>
+          <w:szCs w:val="24"/>
+        </w:rPr>
+        <w:t>E) CONTENT LOADER (SRCE SISTEMA)</w:t>
+      </w:r>
+    </w:p>
+    <w:p>
+      <w:pPr>
+        <w:pStyle w:val="HTMLPreformatted"/>
+        <w:rPr>
+          <w:rStyle w:val="HTMLCode"/>
+          <w:rFonts w:ascii="Times New Roman" w:hAnsi="Times New Roman" w:cs="Times New Roman"/>
+          <w:sz w:val="24"/>
+          <w:szCs w:val="24"/>
+        </w:rPr>
+      </w:pPr>
+      <w:r>
+        <w:rPr>
+          <w:rStyle w:val="HTMLCode"/>
+          <w:rFonts w:ascii="Times New Roman" w:hAnsi="Times New Roman" w:cs="Times New Roman"/>
+          <w:sz w:val="24"/>
+          <w:szCs w:val="24"/>
+        </w:rPr>
+        <w:t>Uvesti jedinstven API sloj (može prvo JSON/localStorage, kasnije DB):</w:t>
+      </w:r>
+    </w:p>
+    <w:p>
+      <w:pPr>
+        <w:pStyle w:val="HTMLPreformatted"/>
+        <w:rPr>
+          <w:rStyle w:val="HTMLCode"/>
+          <w:rFonts w:ascii="Times New Roman" w:hAnsi="Times New Roman" w:cs="Times New Roman"/>
+          <w:sz w:val="24"/>
+          <w:szCs w:val="24"/>
+        </w:rPr>
+      </w:pPr>
+      <w:r>
+        <w:rPr>
+          <w:rStyle w:val="HTMLCode"/>
+          <w:rFonts w:ascii="Times New Roman" w:hAnsi="Times New Roman" w:cs="Times New Roman"/>
+          <w:sz w:val="24"/>
+          <w:szCs w:val="24"/>
+        </w:rPr>
+        <w:t>- getConfig(tenant_id)</w:t>
+      </w:r>
+    </w:p>
+    <w:p>
+      <w:pPr>
+        <w:pStyle w:val="HTMLPreformatted"/>
+        <w:rPr>
+          <w:rStyle w:val="HTMLCode"/>
+          <w:rFonts w:ascii="Times New Roman" w:hAnsi="Times New Roman" w:cs="Times New Roman"/>
+          <w:sz w:val="24"/>
+          <w:szCs w:val="24"/>
+        </w:rPr>
+      </w:pPr>
+      <w:r>
+        <w:rPr>
+          <w:rStyle w:val="HTMLCode"/>
+          <w:rFonts w:ascii="Times New Roman" w:hAnsi="Times New Roman" w:cs="Times New Roman"/>
+          <w:sz w:val="24"/>
+          <w:szCs w:val="24"/>
+        </w:rPr>
+        <w:t>- getSections(tenant_id)</w:t>
+      </w:r>
+    </w:p>
+    <w:p>
+      <w:pPr>
+        <w:pStyle w:val="HTMLPreformatted"/>
+        <w:rPr>
+          <w:rStyle w:val="HTMLCode"/>
+          <w:rFonts w:ascii="Times New Roman" w:hAnsi="Times New Roman" w:cs="Times New Roman"/>
+          <w:sz w:val="24"/>
+          <w:szCs w:val="24"/>
+        </w:rPr>
+      </w:pPr>
+      <w:r>
+        <w:rPr>
+          <w:rStyle w:val="HTMLCode"/>
+          <w:rFonts w:ascii="Times New Roman" w:hAnsi="Times New Roman" w:cs="Times New Roman"/>
+          <w:sz w:val="24"/>
+          <w:szCs w:val="24"/>
+        </w:rPr>
+        <w:t>- getItems(section_key, tenant_id)</w:t>
+      </w:r>
+    </w:p>
+    <w:p>
+      <w:pPr>
+        <w:pStyle w:val="HTMLPreformatted"/>
+        <w:rPr>
+          <w:rStyle w:val="HTMLCode"/>
+          <w:rFonts w:ascii="Times New Roman" w:hAnsi="Times New Roman" w:cs="Times New Roman"/>
+          <w:sz w:val="24"/>
+          <w:szCs w:val="24"/>
+        </w:rPr>
+      </w:pPr>
+      <w:r>
+        <w:rPr>
+          <w:rStyle w:val="HTMLCode"/>
+          <w:rFonts w:ascii="Times New Roman" w:hAnsi="Times New Roman" w:cs="Times New Roman"/>
+          <w:sz w:val="24"/>
+          <w:szCs w:val="24"/>
+        </w:rPr>
+        <w:t>- getParkingPublic(town)</w:t>
+      </w:r>
+    </w:p>
+    <w:p>
+      <w:pPr>
+        <w:pStyle w:val="HTMLPreformatted"/>
+        <w:rPr>
+          <w:rStyle w:val="HTMLCode"/>
+          <w:rFonts w:ascii="Times New Roman" w:hAnsi="Times New Roman" w:cs="Times New Roman"/>
+          <w:sz w:val="24"/>
+          <w:szCs w:val="24"/>
+        </w:rPr>
+      </w:pPr>
+      <w:r>
+        <w:rPr>
+          <w:rStyle w:val="HTMLCode"/>
+          <w:rFonts w:ascii="Times New Roman" w:hAnsi="Times New Roman" w:cs="Times New Roman"/>
+          <w:sz w:val="24"/>
+          <w:szCs w:val="24"/>
+        </w:rPr>
+        <w:t>- getParkingPrivate(tenant_id)</w:t>
+      </w:r>
+    </w:p>
+    <w:p>
+      <w:pPr>
+        <w:pStyle w:val="HTMLPreformatted"/>
+        <w:rPr>
+          <w:rStyle w:val="HTMLCode"/>
+          <w:rFonts w:ascii="Times New Roman" w:hAnsi="Times New Roman" w:cs="Times New Roman"/>
+          <w:sz w:val="24"/>
+          <w:szCs w:val="24"/>
+        </w:rPr>
+      </w:pPr>
+      <w:r>
+        <w:rPr>
+          <w:rStyle w:val="HTMLCode"/>
+          <w:rFonts w:ascii="Times New Roman" w:hAnsi="Times New Roman" w:cs="Times New Roman"/>
+          <w:sz w:val="24"/>
+          <w:szCs w:val="24"/>
+        </w:rPr>
+        <w:t>- getTranslations(lang, tenant_id)</w:t>
+      </w:r>
+    </w:p>
+    <w:p>
+      <w:pPr>
+        <w:pStyle w:val="HTMLPreformatted"/>
+        <w:rPr>
+          <w:rStyle w:val="HTMLCode"/>
+          <w:rFonts w:ascii="Times New Roman" w:hAnsi="Times New Roman" w:cs="Times New Roman"/>
+          <w:sz w:val="24"/>
+          <w:szCs w:val="24"/>
+        </w:rPr>
+      </w:pPr>
+    </w:p>
+    <w:p>
+      <w:pPr>
+        <w:pStyle w:val="HTMLPreformatted"/>
+        <w:rPr>
+          <w:rStyle w:val="HTMLCode"/>
+          <w:rFonts w:ascii="Times New Roman" w:hAnsi="Times New Roman" w:cs="Times New Roman"/>
+          <w:sz w:val="24"/>
+          <w:szCs w:val="24"/>
+        </w:rPr>
+      </w:pPr>
+      <w:r>
+        <w:rPr>
+          <w:rStyle w:val="HTMLCode"/>
+          <w:rFonts w:ascii="Times New Roman" w:hAnsi="Times New Roman" w:cs="Times New Roman"/>
+          <w:sz w:val="24"/>
+          <w:szCs w:val="24"/>
+        </w:rPr>
+        <w:t>Cilj: postojeće render funkcije u app.js ostaju, samo umesto hardcoded/const čitaju preko loader-a.</w:t>
+      </w:r>
+    </w:p>
+    <w:p>
+      <w:pPr>
+        <w:pStyle w:val="HTMLPreformatted"/>
+        <w:rPr>
+          <w:rStyle w:val="HTMLCode"/>
+          <w:rFonts w:ascii="Times New Roman" w:hAnsi="Times New Roman" w:cs="Times New Roman"/>
+          <w:sz w:val="24"/>
+          <w:szCs w:val="24"/>
+        </w:rPr>
+      </w:pPr>
+    </w:p>
+    <w:p>
+      <w:pPr>
+        <w:pStyle w:val="HTMLPreformatted"/>
+        <w:rPr>
+          <w:rStyle w:val="HTMLCode"/>
+          <w:rFonts w:ascii="Times New Roman" w:hAnsi="Times New Roman" w:cs="Times New Roman"/>
+          <w:sz w:val="24"/>
+          <w:szCs w:val="24"/>
+        </w:rPr>
+      </w:pPr>
+      <w:r>
+        <w:rPr>
+          <w:rStyle w:val="HTMLCode"/>
+          <w:rFonts w:ascii="Times New Roman" w:hAnsi="Times New Roman" w:cs="Times New Roman"/>
+          <w:sz w:val="24"/>
+          <w:szCs w:val="24"/>
+        </w:rPr>
+        <w:t>========================</w:t>
+      </w:r>
+    </w:p>
+    <w:p>
+      <w:pPr>
+        <w:pStyle w:val="HTMLPreformatted"/>
+        <w:rPr>
+          <w:rStyle w:val="HTMLCode"/>
+          <w:rFonts w:ascii="Times New Roman" w:hAnsi="Times New Roman" w:cs="Times New Roman"/>
+          <w:sz w:val="24"/>
+          <w:szCs w:val="24"/>
+        </w:rPr>
+      </w:pPr>
+      <w:r>
+        <w:rPr>
+          <w:rStyle w:val="HTMLCode"/>
+          <w:rFonts w:ascii="Times New Roman" w:hAnsi="Times New Roman" w:cs="Times New Roman"/>
+          <w:sz w:val="24"/>
+          <w:szCs w:val="24"/>
+        </w:rPr>
         <w:t>F) ADMIN UI (JEDNOSTAVNO, BEZ REDIZAJNA)</w:t>
       </w:r>
     </w:p>
@@ -2257,6 +2361,7 @@
           <w:sz w:val="24"/>
           <w:szCs w:val="24"/>
         </w:rPr>
+        <w:lastRenderedPageBreak/>
         <w:t>PHASE 5: DB/API (npr. Supabase) + audit + versioning + rollback.</w:t>
       </w:r>
     </w:p>
@@ -2328,7 +2433,6 @@
           <w:sz w:val="24"/>
           <w:szCs w:val="24"/>
         </w:rPr>
-        <w:lastRenderedPageBreak/>
         <w:t>- language switching</w:t>
       </w:r>
     </w:p>

</xml_diff>